<commit_message>
Cap nhat Khoa Ky thuat Dien tu 2 va Nganh Ky thuat Dien - Dien tu trong bao cao Word
</commit_message>
<xml_diff>
--- a/N24DCDT051_DT046_NguyenHoangNam_BaoCao_TienDo1.docx
+++ b/N24DCDT051_DT046_NguyenHoangNam_BaoCao_TienDo1.docx
@@ -63,7 +63,7 @@
             <ns0:rPr>
               <ns0:b/>
             </ns0:rPr>
-            <ns0:t>KỸ THUẬT ĐIỆN TỬ 1</ns0:t>
+            <ns0:t>KỸ THUẬT ĐIỆN TỬ 2</ns0:t>
           </ns0:r>
         </ns0:sdtContent>
       </ns0:sdt>
@@ -196,7 +196,7 @@
             <ns0:rPr>
               <ns0:sz ns0:val="32"/>
             </ns0:rPr>
-            <ns0:t>Kỹ thuật Điện tử - Viễn thông</ns0:t>
+            <ns0:t>Kỹ thuật Điện - Điện tử</ns0:t>
           </ns0:r>
         </ns0:sdtContent>
       </ns0:sdt>
@@ -593,7 +593,7 @@
             <ns0:rPr>
               <ns0:b/>
             </ns0:rPr>
-            <ns0:t>KỸ THUẬT ĐIỆN TỬ 1</ns0:t>
+            <ns0:t>KỸ THUẬT ĐIỆN TỬ 2</ns0:t>
           </ns0:r>
         </ns0:sdtContent>
       </ns0:sdt>
@@ -726,7 +726,7 @@
             <ns0:rPr>
               <ns0:sz ns0:val="32"/>
             </ns0:rPr>
-            <ns0:t>Kỹ thuật Điện tử - Viễn thông</ns0:t>
+            <ns0:t>Kỹ thuật Điện - Điện tử</ns0:t>
           </ns0:r>
         </ns0:sdtContent>
       </ns0:sdt>
@@ -1063,7 +1063,7 @@
               <ns0:sdtEndPr/>
               <ns0:sdtContent>
                 <ns0:r>
-                  <ns0:t>24/10/2026 (Tiến độ 1 - Commit 189ef89)</ns0:t>
+                  <ns0:t>24/10/2026 (Tiến độ 1 - Commit 5741c06)</ns0:t>
                 </ns0:r>
               </ns0:sdtContent>
             </ns0:sdt>

</xml_diff>